<commit_message>
Assets — update Word template, add PowerPoint template
Co-Authored-By: Claude Sonnet 4.6 <noreply@anthropic.com>
</commit_message>
<xml_diff>
--- a/assets/roadmap_template.docx
+++ b/assets/roadmap_template.docx
@@ -42,7 +42,11 @@
         <w:sdt>
           <w:sdtPr>
             <w:rPr>
-              <w:rStyle w:val="TitleChar"/>
+              <w:rStyle w:val="PlaceholderText"/>
+              <w:rFonts w:eastAsia="Calibri"/>
+              <w:color w:val="17365D" w:themeColor="text2" w:themeShade="BF"/>
+              <w:sz w:val="80"/>
+              <w:szCs w:val="80"/>
             </w:rPr>
             <w:alias w:val="Title"/>
             <w:tag w:val=""/>
@@ -67,9 +71,13 @@
                 </w:pPr>
                 <w:r>
                   <w:rPr>
-                    <w:rStyle w:val="TitleChar"/>
+                    <w:rStyle w:val="PlaceholderText"/>
+                    <w:rFonts w:eastAsia="Calibri"/>
+                    <w:color w:val="17365D" w:themeColor="text2" w:themeShade="BF"/>
+                    <w:sz w:val="80"/>
+                    <w:szCs w:val="80"/>
                   </w:rPr>
-                  <w:t>Project Name</w:t>
+                  <w:t>Operations Transformation</w:t>
                 </w:r>
               </w:p>
             </w:tc>
@@ -122,7 +130,7 @@
                     <w:sz w:val="48"/>
                     <w:szCs w:val="48"/>
                   </w:rPr>
-                  <w:t>Document Type</w:t>
+                  <w:t>Roadmap</w:t>
                 </w:r>
               </w:p>
             </w:tc>
@@ -1103,6 +1111,7 @@
     <w:p>
       <w:pPr>
         <w:pStyle w:val="Heading1"/>
+        <w:jc w:val="left"/>
       </w:pPr>
       <w:bookmarkStart w:id="0" w:name="_Toc29201437"/>
       <w:bookmarkStart w:id="1" w:name="_Toc156991076"/>
@@ -1112,127 +1121,6 @@
       </w:r>
       <w:bookmarkEnd w:id="0"/>
       <w:bookmarkEnd w:id="1"/>
-    </w:p>
-    <w:p>
-      <w:pPr>
-        <w:pStyle w:val="Heading2"/>
-      </w:pPr>
-      <w:bookmarkStart w:id="2" w:name="_Toc29201438"/>
-      <w:bookmarkStart w:id="3" w:name="_Toc156991077"/>
-      <w:r>
-        <w:t>???</w:t>
-      </w:r>
-      <w:bookmarkEnd w:id="2"/>
-      <w:bookmarkEnd w:id="3"/>
-    </w:p>
-    <w:p>
-      <w:r>
-        <w:t xml:space="preserve">Text </w:t>
-      </w:r>
-      <w:r>
-        <w:t>here</w:t>
-      </w:r>
-    </w:p>
-    <w:p>
-      <w:pPr>
-        <w:pStyle w:val="Heading2"/>
-      </w:pPr>
-      <w:bookmarkStart w:id="4" w:name="_Toc29201439"/>
-      <w:bookmarkStart w:id="5" w:name="_Toc156991078"/>
-      <w:r>
-        <w:t>???</w:t>
-      </w:r>
-      <w:bookmarkEnd w:id="4"/>
-      <w:bookmarkEnd w:id="5"/>
-    </w:p>
-    <w:p>
-      <w:r>
-        <w:t>Text here</w:t>
-      </w:r>
-    </w:p>
-    <w:p>
-      <w:pPr>
-        <w:pStyle w:val="Heading2"/>
-      </w:pPr>
-      <w:bookmarkStart w:id="6" w:name="_Toc29201440"/>
-      <w:bookmarkStart w:id="7" w:name="_Toc156991079"/>
-      <w:r>
-        <w:t>???</w:t>
-      </w:r>
-      <w:bookmarkEnd w:id="6"/>
-      <w:bookmarkEnd w:id="7"/>
-    </w:p>
-    <w:p>
-      <w:r>
-        <w:t>Text here</w:t>
-      </w:r>
-    </w:p>
-    <w:p>
-      <w:pPr>
-        <w:pStyle w:val="Heading3"/>
-      </w:pPr>
-      <w:bookmarkStart w:id="8" w:name="_Toc29201441"/>
-      <w:bookmarkStart w:id="9" w:name="_Toc156991080"/>
-      <w:r>
-        <w:t>???</w:t>
-      </w:r>
-      <w:bookmarkEnd w:id="8"/>
-      <w:bookmarkEnd w:id="9"/>
-    </w:p>
-    <w:p>
-      <w:bookmarkStart w:id="10" w:name="_Hlk24711579"/>
-      <w:r>
-        <w:t>Text here</w:t>
-      </w:r>
-    </w:p>
-    <w:p>
-      <w:pPr>
-        <w:pStyle w:val="Heading1"/>
-        <w:rPr>
-          <w:rFonts w:eastAsia="Times New Roman"/>
-        </w:rPr>
-      </w:pPr>
-      <w:bookmarkStart w:id="11" w:name="_Toc29201442"/>
-      <w:bookmarkStart w:id="12" w:name="_Toc156991081"/>
-      <w:r>
-        <w:rPr>
-          <w:rFonts w:eastAsia="Times New Roman"/>
-        </w:rPr>
-        <w:lastRenderedPageBreak/>
-        <w:t>???</w:t>
-      </w:r>
-      <w:bookmarkEnd w:id="11"/>
-      <w:bookmarkEnd w:id="12"/>
-    </w:p>
-    <w:p>
-      <w:r>
-        <w:t>Text here</w:t>
-      </w:r>
-    </w:p>
-    <w:p>
-      <w:pPr>
-        <w:pStyle w:val="Heading2"/>
-      </w:pPr>
-      <w:bookmarkStart w:id="13" w:name="_Toc29201443"/>
-      <w:bookmarkStart w:id="14" w:name="_Toc156991082"/>
-      <w:r>
-        <w:t>???</w:t>
-      </w:r>
-      <w:bookmarkEnd w:id="13"/>
-      <w:bookmarkEnd w:id="14"/>
-    </w:p>
-    <w:p>
-      <w:pPr>
-        <w:pStyle w:val="Heading3"/>
-      </w:pPr>
-      <w:bookmarkStart w:id="15" w:name="_Toc29201444"/>
-      <w:bookmarkStart w:id="16" w:name="_Toc156991083"/>
-      <w:r>
-        <w:t>???</w:t>
-      </w:r>
-      <w:bookmarkEnd w:id="10"/>
-      <w:bookmarkEnd w:id="15"/>
-      <w:bookmarkEnd w:id="16"/>
     </w:p>
     <w:sectPr>
       <w:headerReference w:type="default" r:id="rId9"/>
@@ -1454,7 +1342,7 @@
                 <w:rStyle w:val="FooterChar"/>
                 <w:noProof/>
               </w:rPr>
-              <w:t>4</w:t>
+              <w:t>3</w:t>
             </w:r>
           </w:fldSimple>
         </w:p>
@@ -1578,7 +1466,7 @@
             <w:sz w:val="20"/>
             <w:szCs w:val="20"/>
           </w:rPr>
-          <w:t>Document Type</w:t>
+          <w:t>Roadmap</w:t>
         </w:r>
       </w:sdtContent>
     </w:sdt>
@@ -1607,7 +1495,7 @@
             <w:sz w:val="20"/>
             <w:szCs w:val="20"/>
           </w:rPr>
-          <w:t>Project Name</w:t>
+          <w:t>Operations Transformation</w:t>
         </w:r>
       </w:sdtContent>
     </w:sdt>
@@ -5097,9 +4985,15 @@
     <w:rsidRoot w:val="00C40852"/>
     <w:rsid w:val="001F0C59"/>
     <w:rsid w:val="002714A6"/>
+    <w:rsid w:val="00416F18"/>
+    <w:rsid w:val="005E1194"/>
+    <w:rsid w:val="00643469"/>
     <w:rsid w:val="00C40852"/>
+    <w:rsid w:val="00C80FDD"/>
     <w:rsid w:val="00D45064"/>
     <w:rsid w:val="00D538E7"/>
+    <w:rsid w:val="00D924DE"/>
+    <w:rsid w:val="00F31340"/>
   </w:rsids>
   <m:mathPr>
     <m:mathFont m:val="Cambria Math"/>

</xml_diff>

<commit_message>
Multi-audience report redesign — narrator prompt and template updates
claude.py: Replace executive_summary with four-component narrator fields
(executive_summary_opening, executive_summary_para1/2/3, margin_trend_brief,
engagement_overview_paragraph). Add processed file context to user message assembly.
Update generate_report_narrative() to accept interview_roles, document_types,
total_signals, domain_count. Update Section 9 completion_criteria instruction
to execution-voice, named-owner language.

assets/roadmap_template.docx: updated template file.

Co-Authored-By: Claude Sonnet 4.6 <noreply@anthropic.com>
</commit_message>
<xml_diff>
--- a/assets/roadmap_template.docx
+++ b/assets/roadmap_template.docx
@@ -286,8 +286,6 @@
           <w:p/>
           <w:p/>
           <w:p/>
-          <w:p/>
-          <w:p/>
         </w:tc>
       </w:tr>
       <w:tr>
@@ -326,7 +324,13 @@
       </w:sdtPr>
       <w:sdtEndPr>
         <w:rPr>
+          <w:rFonts w:cstheme="minorHAnsi"/>
+          <w:b/>
+          <w:bCs/>
+          <w:caps/>
           <w:noProof/>
+          <w:sz w:val="20"/>
+          <w:szCs w:val="20"/>
         </w:rPr>
       </w:sdtEndPr>
       <w:sdtContent>
@@ -340,8 +344,8 @@
               <w:caps w:val="0"/>
               <w:noProof/>
               <w:kern w:val="2"/>
-              <w:sz w:val="22"/>
-              <w:szCs w:val="22"/>
+              <w:sz w:val="24"/>
+              <w:szCs w:val="24"/>
               <w14:ligatures w14:val="standardContextual"/>
             </w:rPr>
           </w:pPr>
@@ -349,12 +353,12 @@
             <w:fldChar w:fldCharType="begin"/>
           </w:r>
           <w:r>
-            <w:instrText xml:space="preserve"> TOC \o "1-3" \h \z \u </w:instrText>
+            <w:instrText xml:space="preserve"> TOC \o "1-2" \h \z \u </w:instrText>
           </w:r>
           <w:r>
             <w:fldChar w:fldCharType="separate"/>
           </w:r>
-          <w:hyperlink w:anchor="_Toc156991076" w:history="1">
+          <w:hyperlink w:anchor="_Toc226122228" w:history="1">
             <w:r>
               <w:rPr>
                 <w:rStyle w:val="Hyperlink"/>
@@ -370,8 +374,8 @@
                 <w:caps w:val="0"/>
                 <w:noProof/>
                 <w:kern w:val="2"/>
-                <w:sz w:val="22"/>
-                <w:szCs w:val="22"/>
+                <w:sz w:val="24"/>
+                <w:szCs w:val="24"/>
                 <w14:ligatures w14:val="standardContextual"/>
               </w:rPr>
               <w:tab/>
@@ -402,385 +406,7 @@
                 <w:noProof/>
                 <w:webHidden/>
               </w:rPr>
-              <w:instrText xml:space="preserve"> PAGEREF _Toc156991076 \h </w:instrText>
-            </w:r>
-            <w:r>
-              <w:rPr>
-                <w:noProof/>
-                <w:webHidden/>
-              </w:rPr>
-            </w:r>
-            <w:r>
-              <w:rPr>
-                <w:noProof/>
-                <w:webHidden/>
-              </w:rPr>
-              <w:fldChar w:fldCharType="separate"/>
-            </w:r>
-            <w:r>
-              <w:rPr>
-                <w:noProof/>
-                <w:webHidden/>
-              </w:rPr>
-              <w:t>3</w:t>
-            </w:r>
-            <w:r>
-              <w:rPr>
-                <w:noProof/>
-                <w:webHidden/>
-              </w:rPr>
-              <w:fldChar w:fldCharType="end"/>
-            </w:r>
-          </w:hyperlink>
-        </w:p>
-        <w:p>
-          <w:pPr>
-            <w:pStyle w:val="TOC2"/>
-            <w:tabs>
-              <w:tab w:val="left" w:pos="880"/>
-              <w:tab w:val="right" w:leader="dot" w:pos="9350"/>
-            </w:tabs>
-            <w:rPr>
-              <w:rFonts w:asciiTheme="minorHAnsi" w:eastAsiaTheme="minorEastAsia" w:hAnsiTheme="minorHAnsi" w:cstheme="minorBidi"/>
-              <w:smallCaps w:val="0"/>
-              <w:noProof/>
-              <w:kern w:val="2"/>
-              <w:sz w:val="22"/>
-              <w:szCs w:val="22"/>
-              <w14:ligatures w14:val="standardContextual"/>
-            </w:rPr>
-          </w:pPr>
-          <w:hyperlink w:anchor="_Toc156991077" w:history="1">
-            <w:r>
-              <w:rPr>
-                <w:rStyle w:val="Hyperlink"/>
-                <w:noProof/>
-              </w:rPr>
-              <w:t>1.1</w:t>
-            </w:r>
-            <w:r>
-              <w:rPr>
-                <w:rFonts w:asciiTheme="minorHAnsi" w:eastAsiaTheme="minorEastAsia" w:hAnsiTheme="minorHAnsi" w:cstheme="minorBidi"/>
-                <w:smallCaps w:val="0"/>
-                <w:noProof/>
-                <w:kern w:val="2"/>
-                <w:sz w:val="22"/>
-                <w:szCs w:val="22"/>
-                <w14:ligatures w14:val="standardContextual"/>
-              </w:rPr>
-              <w:tab/>
-            </w:r>
-            <w:r>
-              <w:rPr>
-                <w:rStyle w:val="Hyperlink"/>
-                <w:noProof/>
-              </w:rPr>
-              <w:t>???</w:t>
-            </w:r>
-            <w:r>
-              <w:rPr>
-                <w:noProof/>
-                <w:webHidden/>
-              </w:rPr>
-              <w:tab/>
-            </w:r>
-            <w:r>
-              <w:rPr>
-                <w:noProof/>
-                <w:webHidden/>
-              </w:rPr>
-              <w:fldChar w:fldCharType="begin"/>
-            </w:r>
-            <w:r>
-              <w:rPr>
-                <w:noProof/>
-                <w:webHidden/>
-              </w:rPr>
-              <w:instrText xml:space="preserve"> PAGEREF _Toc156991077 \h </w:instrText>
-            </w:r>
-            <w:r>
-              <w:rPr>
-                <w:noProof/>
-                <w:webHidden/>
-              </w:rPr>
-            </w:r>
-            <w:r>
-              <w:rPr>
-                <w:noProof/>
-                <w:webHidden/>
-              </w:rPr>
-              <w:fldChar w:fldCharType="separate"/>
-            </w:r>
-            <w:r>
-              <w:rPr>
-                <w:noProof/>
-                <w:webHidden/>
-              </w:rPr>
-              <w:t>3</w:t>
-            </w:r>
-            <w:r>
-              <w:rPr>
-                <w:noProof/>
-                <w:webHidden/>
-              </w:rPr>
-              <w:fldChar w:fldCharType="end"/>
-            </w:r>
-          </w:hyperlink>
-        </w:p>
-        <w:p>
-          <w:pPr>
-            <w:pStyle w:val="TOC2"/>
-            <w:tabs>
-              <w:tab w:val="left" w:pos="880"/>
-              <w:tab w:val="right" w:leader="dot" w:pos="9350"/>
-            </w:tabs>
-            <w:rPr>
-              <w:rFonts w:asciiTheme="minorHAnsi" w:eastAsiaTheme="minorEastAsia" w:hAnsiTheme="minorHAnsi" w:cstheme="minorBidi"/>
-              <w:smallCaps w:val="0"/>
-              <w:noProof/>
-              <w:kern w:val="2"/>
-              <w:sz w:val="22"/>
-              <w:szCs w:val="22"/>
-              <w14:ligatures w14:val="standardContextual"/>
-            </w:rPr>
-          </w:pPr>
-          <w:hyperlink w:anchor="_Toc156991078" w:history="1">
-            <w:r>
-              <w:rPr>
-                <w:rStyle w:val="Hyperlink"/>
-                <w:noProof/>
-              </w:rPr>
-              <w:t>1.2</w:t>
-            </w:r>
-            <w:r>
-              <w:rPr>
-                <w:rFonts w:asciiTheme="minorHAnsi" w:eastAsiaTheme="minorEastAsia" w:hAnsiTheme="minorHAnsi" w:cstheme="minorBidi"/>
-                <w:smallCaps w:val="0"/>
-                <w:noProof/>
-                <w:kern w:val="2"/>
-                <w:sz w:val="22"/>
-                <w:szCs w:val="22"/>
-                <w14:ligatures w14:val="standardContextual"/>
-              </w:rPr>
-              <w:tab/>
-            </w:r>
-            <w:r>
-              <w:rPr>
-                <w:rStyle w:val="Hyperlink"/>
-                <w:noProof/>
-              </w:rPr>
-              <w:t>???</w:t>
-            </w:r>
-            <w:r>
-              <w:rPr>
-                <w:noProof/>
-                <w:webHidden/>
-              </w:rPr>
-              <w:tab/>
-            </w:r>
-            <w:r>
-              <w:rPr>
-                <w:noProof/>
-                <w:webHidden/>
-              </w:rPr>
-              <w:fldChar w:fldCharType="begin"/>
-            </w:r>
-            <w:r>
-              <w:rPr>
-                <w:noProof/>
-                <w:webHidden/>
-              </w:rPr>
-              <w:instrText xml:space="preserve"> PAGEREF _Toc156991078 \h </w:instrText>
-            </w:r>
-            <w:r>
-              <w:rPr>
-                <w:noProof/>
-                <w:webHidden/>
-              </w:rPr>
-            </w:r>
-            <w:r>
-              <w:rPr>
-                <w:noProof/>
-                <w:webHidden/>
-              </w:rPr>
-              <w:fldChar w:fldCharType="separate"/>
-            </w:r>
-            <w:r>
-              <w:rPr>
-                <w:noProof/>
-                <w:webHidden/>
-              </w:rPr>
-              <w:t>3</w:t>
-            </w:r>
-            <w:r>
-              <w:rPr>
-                <w:noProof/>
-                <w:webHidden/>
-              </w:rPr>
-              <w:fldChar w:fldCharType="end"/>
-            </w:r>
-          </w:hyperlink>
-        </w:p>
-        <w:p>
-          <w:pPr>
-            <w:pStyle w:val="TOC2"/>
-            <w:tabs>
-              <w:tab w:val="left" w:pos="880"/>
-              <w:tab w:val="right" w:leader="dot" w:pos="9350"/>
-            </w:tabs>
-            <w:rPr>
-              <w:rFonts w:asciiTheme="minorHAnsi" w:eastAsiaTheme="minorEastAsia" w:hAnsiTheme="minorHAnsi" w:cstheme="minorBidi"/>
-              <w:smallCaps w:val="0"/>
-              <w:noProof/>
-              <w:kern w:val="2"/>
-              <w:sz w:val="22"/>
-              <w:szCs w:val="22"/>
-              <w14:ligatures w14:val="standardContextual"/>
-            </w:rPr>
-          </w:pPr>
-          <w:hyperlink w:anchor="_Toc156991079" w:history="1">
-            <w:r>
-              <w:rPr>
-                <w:rStyle w:val="Hyperlink"/>
-                <w:noProof/>
-              </w:rPr>
-              <w:t>1.3</w:t>
-            </w:r>
-            <w:r>
-              <w:rPr>
-                <w:rFonts w:asciiTheme="minorHAnsi" w:eastAsiaTheme="minorEastAsia" w:hAnsiTheme="minorHAnsi" w:cstheme="minorBidi"/>
-                <w:smallCaps w:val="0"/>
-                <w:noProof/>
-                <w:kern w:val="2"/>
-                <w:sz w:val="22"/>
-                <w:szCs w:val="22"/>
-                <w14:ligatures w14:val="standardContextual"/>
-              </w:rPr>
-              <w:tab/>
-            </w:r>
-            <w:r>
-              <w:rPr>
-                <w:rStyle w:val="Hyperlink"/>
-                <w:noProof/>
-              </w:rPr>
-              <w:t>???</w:t>
-            </w:r>
-            <w:r>
-              <w:rPr>
-                <w:noProof/>
-                <w:webHidden/>
-              </w:rPr>
-              <w:tab/>
-            </w:r>
-            <w:r>
-              <w:rPr>
-                <w:noProof/>
-                <w:webHidden/>
-              </w:rPr>
-              <w:fldChar w:fldCharType="begin"/>
-            </w:r>
-            <w:r>
-              <w:rPr>
-                <w:noProof/>
-                <w:webHidden/>
-              </w:rPr>
-              <w:instrText xml:space="preserve"> PAGEREF _Toc156991079 \h </w:instrText>
-            </w:r>
-            <w:r>
-              <w:rPr>
-                <w:noProof/>
-                <w:webHidden/>
-              </w:rPr>
-            </w:r>
-            <w:r>
-              <w:rPr>
-                <w:noProof/>
-                <w:webHidden/>
-              </w:rPr>
-              <w:fldChar w:fldCharType="separate"/>
-            </w:r>
-            <w:r>
-              <w:rPr>
-                <w:noProof/>
-                <w:webHidden/>
-              </w:rPr>
-              <w:t>3</w:t>
-            </w:r>
-            <w:r>
-              <w:rPr>
-                <w:noProof/>
-                <w:webHidden/>
-              </w:rPr>
-              <w:fldChar w:fldCharType="end"/>
-            </w:r>
-          </w:hyperlink>
-        </w:p>
-        <w:p>
-          <w:pPr>
-            <w:pStyle w:val="TOC3"/>
-            <w:tabs>
-              <w:tab w:val="left" w:pos="1100"/>
-              <w:tab w:val="right" w:leader="dot" w:pos="9350"/>
-            </w:tabs>
-            <w:rPr>
-              <w:rFonts w:asciiTheme="minorHAnsi" w:eastAsiaTheme="minorEastAsia" w:hAnsiTheme="minorHAnsi" w:cstheme="minorBidi"/>
-              <w:i w:val="0"/>
-              <w:iCs w:val="0"/>
-              <w:noProof/>
-              <w:kern w:val="2"/>
-              <w:sz w:val="22"/>
-              <w:szCs w:val="22"/>
-              <w14:ligatures w14:val="standardContextual"/>
-            </w:rPr>
-          </w:pPr>
-          <w:hyperlink w:anchor="_Toc156991080" w:history="1">
-            <w:r>
-              <w:rPr>
-                <w:rStyle w:val="Hyperlink"/>
-                <w:noProof/>
-              </w:rPr>
-              <w:t>1.3.1</w:t>
-            </w:r>
-            <w:r>
-              <w:rPr>
-                <w:rFonts w:asciiTheme="minorHAnsi" w:eastAsiaTheme="minorEastAsia" w:hAnsiTheme="minorHAnsi" w:cstheme="minorBidi"/>
-                <w:i w:val="0"/>
-                <w:iCs w:val="0"/>
-                <w:noProof/>
-                <w:kern w:val="2"/>
-                <w:sz w:val="22"/>
-                <w:szCs w:val="22"/>
-                <w14:ligatures w14:val="standardContextual"/>
-              </w:rPr>
-              <w:tab/>
-            </w:r>
-            <w:r>
-              <w:rPr>
-                <w:rStyle w:val="Hyperlink"/>
-                <w:noProof/>
-              </w:rPr>
-              <w:t>???</w:t>
-            </w:r>
-            <w:r>
-              <w:rPr>
-                <w:noProof/>
-                <w:webHidden/>
-              </w:rPr>
-              <w:tab/>
-            </w:r>
-            <w:r>
-              <w:rPr>
-                <w:noProof/>
-                <w:webHidden/>
-              </w:rPr>
-              <w:fldChar w:fldCharType="begin"/>
-            </w:r>
-            <w:r>
-              <w:rPr>
-                <w:noProof/>
-                <w:webHidden/>
-              </w:rPr>
-              <w:instrText xml:space="preserve"> PAGEREF _Toc156991080 \h </w:instrText>
+              <w:instrText xml:space="preserve"> PAGEREF _Toc226122228 \h </w:instrText>
             </w:r>
             <w:r>
               <w:rPr>
@@ -814,294 +440,8 @@
         <w:p>
           <w:pPr>
             <w:pStyle w:val="TOC1"/>
-            <w:rPr>
-              <w:rFonts w:asciiTheme="minorHAnsi" w:eastAsiaTheme="minorEastAsia" w:hAnsiTheme="minorHAnsi" w:cstheme="minorBidi"/>
-              <w:b w:val="0"/>
-              <w:bCs w:val="0"/>
-              <w:caps w:val="0"/>
-              <w:noProof/>
-              <w:kern w:val="2"/>
-              <w:sz w:val="22"/>
-              <w:szCs w:val="22"/>
-              <w14:ligatures w14:val="standardContextual"/>
-            </w:rPr>
           </w:pPr>
-          <w:hyperlink w:anchor="_Toc156991081" w:history="1">
-            <w:r>
-              <w:rPr>
-                <w:rStyle w:val="Hyperlink"/>
-                <w:noProof/>
-              </w:rPr>
-              <w:t>2</w:t>
-            </w:r>
-            <w:r>
-              <w:rPr>
-                <w:rFonts w:asciiTheme="minorHAnsi" w:eastAsiaTheme="minorEastAsia" w:hAnsiTheme="minorHAnsi" w:cstheme="minorBidi"/>
-                <w:b w:val="0"/>
-                <w:bCs w:val="0"/>
-                <w:caps w:val="0"/>
-                <w:noProof/>
-                <w:kern w:val="2"/>
-                <w:sz w:val="22"/>
-                <w:szCs w:val="22"/>
-                <w14:ligatures w14:val="standardContextual"/>
-              </w:rPr>
-              <w:tab/>
-            </w:r>
-            <w:r>
-              <w:rPr>
-                <w:rStyle w:val="Hyperlink"/>
-                <w:noProof/>
-              </w:rPr>
-              <w:t>???</w:t>
-            </w:r>
-            <w:r>
-              <w:rPr>
-                <w:noProof/>
-                <w:webHidden/>
-              </w:rPr>
-              <w:tab/>
-            </w:r>
-            <w:r>
-              <w:rPr>
-                <w:noProof/>
-                <w:webHidden/>
-              </w:rPr>
-              <w:fldChar w:fldCharType="begin"/>
-            </w:r>
-            <w:r>
-              <w:rPr>
-                <w:noProof/>
-                <w:webHidden/>
-              </w:rPr>
-              <w:instrText xml:space="preserve"> PAGEREF _Toc156991081 \h </w:instrText>
-            </w:r>
-            <w:r>
-              <w:rPr>
-                <w:noProof/>
-                <w:webHidden/>
-              </w:rPr>
-            </w:r>
-            <w:r>
-              <w:rPr>
-                <w:noProof/>
-                <w:webHidden/>
-              </w:rPr>
-              <w:fldChar w:fldCharType="separate"/>
-            </w:r>
-            <w:r>
-              <w:rPr>
-                <w:noProof/>
-                <w:webHidden/>
-              </w:rPr>
-              <w:t>4</w:t>
-            </w:r>
-            <w:r>
-              <w:rPr>
-                <w:noProof/>
-                <w:webHidden/>
-              </w:rPr>
-              <w:fldChar w:fldCharType="end"/>
-            </w:r>
-          </w:hyperlink>
-        </w:p>
-        <w:p>
-          <w:pPr>
-            <w:pStyle w:val="TOC2"/>
-            <w:tabs>
-              <w:tab w:val="left" w:pos="880"/>
-              <w:tab w:val="right" w:leader="dot" w:pos="9350"/>
-            </w:tabs>
-            <w:rPr>
-              <w:rFonts w:asciiTheme="minorHAnsi" w:eastAsiaTheme="minorEastAsia" w:hAnsiTheme="minorHAnsi" w:cstheme="minorBidi"/>
-              <w:smallCaps w:val="0"/>
-              <w:noProof/>
-              <w:kern w:val="2"/>
-              <w:sz w:val="22"/>
-              <w:szCs w:val="22"/>
-              <w14:ligatures w14:val="standardContextual"/>
-            </w:rPr>
-          </w:pPr>
-          <w:hyperlink w:anchor="_Toc156991082" w:history="1">
-            <w:r>
-              <w:rPr>
-                <w:rStyle w:val="Hyperlink"/>
-                <w:noProof/>
-              </w:rPr>
-              <w:t>2.1</w:t>
-            </w:r>
-            <w:r>
-              <w:rPr>
-                <w:rFonts w:asciiTheme="minorHAnsi" w:eastAsiaTheme="minorEastAsia" w:hAnsiTheme="minorHAnsi" w:cstheme="minorBidi"/>
-                <w:smallCaps w:val="0"/>
-                <w:noProof/>
-                <w:kern w:val="2"/>
-                <w:sz w:val="22"/>
-                <w:szCs w:val="22"/>
-                <w14:ligatures w14:val="standardContextual"/>
-              </w:rPr>
-              <w:tab/>
-            </w:r>
-            <w:r>
-              <w:rPr>
-                <w:rStyle w:val="Hyperlink"/>
-                <w:noProof/>
-              </w:rPr>
-              <w:t>???</w:t>
-            </w:r>
-            <w:r>
-              <w:rPr>
-                <w:noProof/>
-                <w:webHidden/>
-              </w:rPr>
-              <w:tab/>
-            </w:r>
-            <w:r>
-              <w:rPr>
-                <w:noProof/>
-                <w:webHidden/>
-              </w:rPr>
-              <w:fldChar w:fldCharType="begin"/>
-            </w:r>
-            <w:r>
-              <w:rPr>
-                <w:noProof/>
-                <w:webHidden/>
-              </w:rPr>
-              <w:instrText xml:space="preserve"> PAGEREF _Toc156991082 \h </w:instrText>
-            </w:r>
-            <w:r>
-              <w:rPr>
-                <w:noProof/>
-                <w:webHidden/>
-              </w:rPr>
-            </w:r>
-            <w:r>
-              <w:rPr>
-                <w:noProof/>
-                <w:webHidden/>
-              </w:rPr>
-              <w:fldChar w:fldCharType="separate"/>
-            </w:r>
-            <w:r>
-              <w:rPr>
-                <w:noProof/>
-                <w:webHidden/>
-              </w:rPr>
-              <w:t>4</w:t>
-            </w:r>
-            <w:r>
-              <w:rPr>
-                <w:noProof/>
-                <w:webHidden/>
-              </w:rPr>
-              <w:fldChar w:fldCharType="end"/>
-            </w:r>
-          </w:hyperlink>
-        </w:p>
-        <w:p>
-          <w:pPr>
-            <w:pStyle w:val="TOC3"/>
-            <w:tabs>
-              <w:tab w:val="left" w:pos="1100"/>
-              <w:tab w:val="right" w:leader="dot" w:pos="9350"/>
-            </w:tabs>
-            <w:rPr>
-              <w:rFonts w:asciiTheme="minorHAnsi" w:eastAsiaTheme="minorEastAsia" w:hAnsiTheme="minorHAnsi" w:cstheme="minorBidi"/>
-              <w:i w:val="0"/>
-              <w:iCs w:val="0"/>
-              <w:noProof/>
-              <w:kern w:val="2"/>
-              <w:sz w:val="22"/>
-              <w:szCs w:val="22"/>
-              <w14:ligatures w14:val="standardContextual"/>
-            </w:rPr>
-          </w:pPr>
-          <w:hyperlink w:anchor="_Toc156991083" w:history="1">
-            <w:r>
-              <w:rPr>
-                <w:rStyle w:val="Hyperlink"/>
-                <w:noProof/>
-              </w:rPr>
-              <w:t>2.1.1</w:t>
-            </w:r>
-            <w:r>
-              <w:rPr>
-                <w:rFonts w:asciiTheme="minorHAnsi" w:eastAsiaTheme="minorEastAsia" w:hAnsiTheme="minorHAnsi" w:cstheme="minorBidi"/>
-                <w:i w:val="0"/>
-                <w:iCs w:val="0"/>
-                <w:noProof/>
-                <w:kern w:val="2"/>
-                <w:sz w:val="22"/>
-                <w:szCs w:val="22"/>
-                <w14:ligatures w14:val="standardContextual"/>
-              </w:rPr>
-              <w:tab/>
-            </w:r>
-            <w:r>
-              <w:rPr>
-                <w:rStyle w:val="Hyperlink"/>
-                <w:noProof/>
-              </w:rPr>
-              <w:t>???</w:t>
-            </w:r>
-            <w:r>
-              <w:rPr>
-                <w:noProof/>
-                <w:webHidden/>
-              </w:rPr>
-              <w:tab/>
-            </w:r>
-            <w:r>
-              <w:rPr>
-                <w:noProof/>
-                <w:webHidden/>
-              </w:rPr>
-              <w:fldChar w:fldCharType="begin"/>
-            </w:r>
-            <w:r>
-              <w:rPr>
-                <w:noProof/>
-                <w:webHidden/>
-              </w:rPr>
-              <w:instrText xml:space="preserve"> PAGEREF _Toc156991083 \h </w:instrText>
-            </w:r>
-            <w:r>
-              <w:rPr>
-                <w:noProof/>
-                <w:webHidden/>
-              </w:rPr>
-            </w:r>
-            <w:r>
-              <w:rPr>
-                <w:noProof/>
-                <w:webHidden/>
-              </w:rPr>
-              <w:fldChar w:fldCharType="separate"/>
-            </w:r>
-            <w:r>
-              <w:rPr>
-                <w:noProof/>
-                <w:webHidden/>
-              </w:rPr>
-              <w:t>4</w:t>
-            </w:r>
-            <w:r>
-              <w:rPr>
-                <w:noProof/>
-                <w:webHidden/>
-              </w:rPr>
-              <w:fldChar w:fldCharType="end"/>
-            </w:r>
-          </w:hyperlink>
-        </w:p>
-        <w:p>
           <w:r>
-            <w:rPr>
-              <w:b/>
-              <w:bCs/>
-              <w:noProof/>
-            </w:rPr>
             <w:fldChar w:fldCharType="end"/>
           </w:r>
         </w:p>
@@ -1114,7 +454,7 @@
         <w:jc w:val="left"/>
       </w:pPr>
       <w:bookmarkStart w:id="0" w:name="_Toc29201437"/>
-      <w:bookmarkStart w:id="1" w:name="_Toc156991076"/>
+      <w:bookmarkStart w:id="1" w:name="_Toc226122228"/>
       <w:r>
         <w:lastRenderedPageBreak/>
         <w:t>???</w:t>
@@ -4992,7 +4332,9 @@
     <w:rsid w:val="001F0C59"/>
     <w:rsid w:val="002714A6"/>
     <w:rsid w:val="002E79D1"/>
+    <w:rsid w:val="002F6AD3"/>
     <w:rsid w:val="00416F18"/>
+    <w:rsid w:val="00490059"/>
     <w:rsid w:val="00493C18"/>
     <w:rsid w:val="005E1194"/>
     <w:rsid w:val="00643469"/>
@@ -5001,6 +4343,8 @@
     <w:rsid w:val="00D45064"/>
     <w:rsid w:val="00D538E7"/>
     <w:rsid w:val="00D924DE"/>
+    <w:rsid w:val="00DF10AF"/>
+    <w:rsid w:val="00E41951"/>
     <w:rsid w:val="00F31340"/>
   </w:rsids>
   <m:mathPr>

</xml_diff>

<commit_message>
final commit for day
</commit_message>
<xml_diff>
--- a/assets/roadmap_template.docx
+++ b/assets/roadmap_template.docx
@@ -514,7 +514,7 @@
           <w:r>
             <w:fldChar w:fldCharType="separate"/>
           </w:r>
-          <w:hyperlink w:anchor="_Toc226210068" w:history="1">
+          <w:hyperlink w:anchor="_Toc226215592" w:history="1">
             <w:r>
               <w:rPr>
                 <w:rStyle w:val="Hyperlink"/>
@@ -541,7 +541,7 @@
                 <w:rStyle w:val="Hyperlink"/>
                 <w:noProof/>
               </w:rPr>
-              <w:t>Executive Summary</w:t>
+              <w:t>???</w:t>
             </w:r>
             <w:r>
               <w:rPr>
@@ -562,7 +562,7 @@
                 <w:noProof/>
                 <w:webHidden/>
               </w:rPr>
-              <w:instrText xml:space="preserve"> PAGEREF _Toc226210068 \h </w:instrText>
+              <w:instrText xml:space="preserve"> PAGEREF _Toc226215592 \h </w:instrText>
             </w:r>
             <w:r>
               <w:rPr>
@@ -618,23 +618,18 @@
     <w:p>
       <w:pPr>
         <w:pStyle w:val="Heading1"/>
-        <w:jc w:val="left"/>
-      </w:pPr>
-      <w:bookmarkStart w:id="0" w:name="_Toc226210068"/>
+      </w:pPr>
+      <w:bookmarkStart w:id="0" w:name="_Toc226215592"/>
       <w:r>
         <w:lastRenderedPageBreak/>
-        <w:t>Executive Summary</w:t>
+        <w:t>???</w:t>
       </w:r>
       <w:bookmarkEnd w:id="0"/>
     </w:p>
-    <w:p>
-      <w:pPr>
-        <w:spacing w:after="60"/>
-        <w:jc w:val="left"/>
-      </w:pPr>
-    </w:p>
     <w:sectPr>
-      <w:headerReference w:type="first" r:id="rId13"/>
+      <w:headerReference w:type="default" r:id="rId13"/>
+      <w:footerReference w:type="default" r:id="rId14"/>
+      <w:headerReference w:type="first" r:id="rId15"/>
       <w:pgSz w:w="12240" w:h="15840"/>
       <w:pgMar w:top="1440" w:right="1440" w:bottom="1440" w:left="1440" w:header="720" w:footer="720" w:gutter="0"/>
       <w:cols w:space="720"/>
@@ -793,6 +788,132 @@
 </w:ftr>
 </file>
 
+<file path=word/footer2.xml><?xml version="1.0" encoding="utf-8"?>
+<w:ftr xmlns:wpc="http://schemas.microsoft.com/office/word/2010/wordprocessingCanvas" xmlns:cx="http://schemas.microsoft.com/office/drawing/2014/chartex" xmlns:cx1="http://schemas.microsoft.com/office/drawing/2015/9/8/chartex" xmlns:cx2="http://schemas.microsoft.com/office/drawing/2015/10/21/chartex" xmlns:cx3="http://schemas.microsoft.com/office/drawing/2016/5/9/chartex" xmlns:cx4="http://schemas.microsoft.com/office/drawing/2016/5/10/chartex" xmlns:cx5="http://schemas.microsoft.com/office/drawing/2016/5/11/chartex" xmlns:cx6="http://schemas.microsoft.com/office/drawing/2016/5/12/chartex" xmlns:cx7="http://schemas.microsoft.com/office/drawing/2016/5/13/chartex" xmlns:cx8="http://schemas.microsoft.com/office/drawing/2016/5/14/chartex" xmlns:mc="http://schemas.openxmlformats.org/markup-compatibility/2006" xmlns:aink="http://schemas.microsoft.com/office/drawing/2016/ink" xmlns:am3d="http://schemas.microsoft.com/office/drawing/2017/model3d" xmlns:o="urn:schemas-microsoft-com:office:office" xmlns:oel="http://schemas.microsoft.com/office/2019/extlst" xmlns:r="http://schemas.openxmlformats.org/officeDocument/2006/relationships" xmlns:m="http://schemas.openxmlformats.org/officeDocument/2006/math" xmlns:v="urn:schemas-microsoft-com:vml" xmlns:wp14="http://schemas.microsoft.com/office/word/2010/wordprocessingDrawing" xmlns:wp="http://schemas.openxmlformats.org/drawingml/2006/wordprocessingDrawing" xmlns:w10="urn:schemas-microsoft-com:office:word" xmlns:w="http://schemas.openxmlformats.org/wordprocessingml/2006/main" xmlns:w14="http://schemas.microsoft.com/office/word/2010/wordml" xmlns:w15="http://schemas.microsoft.com/office/word/2012/wordml" xmlns:w16cex="http://schemas.microsoft.com/office/word/2018/wordml/cex" xmlns:w16cid="http://schemas.microsoft.com/office/word/2016/wordml/cid" xmlns:w16="http://schemas.microsoft.com/office/word/2018/wordml" xmlns:w16du="http://schemas.microsoft.com/office/word/2023/wordml/word16du" xmlns:w16sdtdh="http://schemas.microsoft.com/office/word/2020/wordml/sdtdatahash" xmlns:w16sdtfl="http://schemas.microsoft.com/office/word/2024/wordml/sdtformatlock" xmlns:w16se="http://schemas.microsoft.com/office/word/2015/wordml/symex" xmlns:wpg="http://schemas.microsoft.com/office/word/2010/wordprocessingGroup" xmlns:wpi="http://schemas.microsoft.com/office/word/2010/wordprocessingInk" xmlns:wne="http://schemas.microsoft.com/office/word/2006/wordml" xmlns:wps="http://schemas.microsoft.com/office/word/2010/wordprocessingShape" mc:Ignorable="w14 w15 w16se w16cid w16 w16cex w16sdtdh w16sdtfl w16du wp14">
+  <w:sdt>
+    <w:sdtPr>
+      <w:id w:val="2128196675"/>
+      <w:docPartObj>
+        <w:docPartGallery w:val="Page Numbers (Bottom of Page)"/>
+        <w:docPartUnique/>
+      </w:docPartObj>
+    </w:sdtPr>
+    <w:sdtContent>
+      <w:sdt>
+        <w:sdtPr>
+          <w:id w:val="-1077508866"/>
+          <w:docPartObj>
+            <w:docPartGallery w:val="Page Numbers (Top of Page)"/>
+            <w:docPartUnique/>
+          </w:docPartObj>
+        </w:sdtPr>
+        <w:sdtContent>
+          <w:p>
+            <w:pPr>
+              <w:pStyle w:val="Footer"/>
+              <w:tabs>
+                <w:tab w:val="clear" w:pos="4680"/>
+                <w:tab w:val="left" w:pos="3420"/>
+              </w:tabs>
+            </w:pPr>
+            <w:r>
+              <w:t xml:space="preserve">TunTech LLC | Confidential </w:t>
+            </w:r>
+            <w:r>
+              <w:tab/>
+            </w:r>
+            <w:r>
+              <w:t>Operational Performance Diagnostic</w:t>
+            </w:r>
+            <w:r>
+              <w:tab/>
+              <w:t xml:space="preserve">Page </w:t>
+            </w:r>
+            <w:r>
+              <w:rPr>
+                <w:sz w:val="24"/>
+                <w:szCs w:val="24"/>
+              </w:rPr>
+              <w:fldChar w:fldCharType="begin"/>
+            </w:r>
+            <w:r>
+              <w:instrText xml:space="preserve"> PAGE </w:instrText>
+            </w:r>
+            <w:r>
+              <w:rPr>
+                <w:sz w:val="24"/>
+                <w:szCs w:val="24"/>
+              </w:rPr>
+              <w:fldChar w:fldCharType="separate"/>
+            </w:r>
+            <w:r>
+              <w:rPr>
+                <w:sz w:val="24"/>
+                <w:szCs w:val="24"/>
+              </w:rPr>
+              <w:t>3</w:t>
+            </w:r>
+            <w:r>
+              <w:rPr>
+                <w:sz w:val="24"/>
+                <w:szCs w:val="24"/>
+              </w:rPr>
+              <w:fldChar w:fldCharType="end"/>
+            </w:r>
+            <w:r>
+              <w:t xml:space="preserve"> of </w:t>
+            </w:r>
+            <w:r>
+              <w:rPr>
+                <w:b/>
+                <w:bCs/>
+                <w:sz w:val="24"/>
+                <w:szCs w:val="24"/>
+              </w:rPr>
+              <w:fldChar w:fldCharType="begin"/>
+            </w:r>
+            <w:r>
+              <w:rPr>
+                <w:b/>
+                <w:bCs/>
+              </w:rPr>
+              <w:instrText xml:space="preserve"> NUMPAGES  </w:instrText>
+            </w:r>
+            <w:r>
+              <w:rPr>
+                <w:b/>
+                <w:bCs/>
+                <w:sz w:val="24"/>
+                <w:szCs w:val="24"/>
+              </w:rPr>
+              <w:fldChar w:fldCharType="separate"/>
+            </w:r>
+            <w:r>
+              <w:rPr>
+                <w:b/>
+                <w:bCs/>
+                <w:sz w:val="24"/>
+                <w:szCs w:val="24"/>
+              </w:rPr>
+              <w:t>4</w:t>
+            </w:r>
+            <w:r>
+              <w:rPr>
+                <w:b/>
+                <w:bCs/>
+                <w:sz w:val="24"/>
+                <w:szCs w:val="24"/>
+              </w:rPr>
+              <w:fldChar w:fldCharType="end"/>
+            </w:r>
+          </w:p>
+        </w:sdtContent>
+      </w:sdt>
+    </w:sdtContent>
+  </w:sdt>
+</w:ftr>
+</file>
+
 <file path=word/footnotes.xml><?xml version="1.0" encoding="utf-8"?>
 <w:footnotes xmlns:wpc="http://schemas.microsoft.com/office/word/2010/wordprocessingCanvas" xmlns:cx="http://schemas.microsoft.com/office/drawing/2014/chartex" xmlns:cx1="http://schemas.microsoft.com/office/drawing/2015/9/8/chartex" xmlns:cx2="http://schemas.microsoft.com/office/drawing/2015/10/21/chartex" xmlns:cx3="http://schemas.microsoft.com/office/drawing/2016/5/9/chartex" xmlns:cx4="http://schemas.microsoft.com/office/drawing/2016/5/10/chartex" xmlns:cx5="http://schemas.microsoft.com/office/drawing/2016/5/11/chartex" xmlns:cx6="http://schemas.microsoft.com/office/drawing/2016/5/12/chartex" xmlns:cx7="http://schemas.microsoft.com/office/drawing/2016/5/13/chartex" xmlns:cx8="http://schemas.microsoft.com/office/drawing/2016/5/14/chartex" xmlns:mc="http://schemas.openxmlformats.org/markup-compatibility/2006" xmlns:aink="http://schemas.microsoft.com/office/drawing/2016/ink" xmlns:am3d="http://schemas.microsoft.com/office/drawing/2017/model3d" xmlns:o="urn:schemas-microsoft-com:office:office" xmlns:oel="http://schemas.microsoft.com/office/2019/extlst" xmlns:r="http://schemas.openxmlformats.org/officeDocument/2006/relationships" xmlns:m="http://schemas.openxmlformats.org/officeDocument/2006/math" xmlns:v="urn:schemas-microsoft-com:vml" xmlns:wp14="http://schemas.microsoft.com/office/word/2010/wordprocessingDrawing" xmlns:wp="http://schemas.openxmlformats.org/drawingml/2006/wordprocessingDrawing" xmlns:w10="urn:schemas-microsoft-com:office:word" xmlns:w="http://schemas.openxmlformats.org/wordprocessingml/2006/main" xmlns:w14="http://schemas.microsoft.com/office/word/2010/wordml" xmlns:w15="http://schemas.microsoft.com/office/word/2012/wordml" xmlns:w16cex="http://schemas.microsoft.com/office/word/2018/wordml/cex" xmlns:w16cid="http://schemas.microsoft.com/office/word/2016/wordml/cid" xmlns:w16="http://schemas.microsoft.com/office/word/2018/wordml" xmlns:w16du="http://schemas.microsoft.com/office/word/2023/wordml/word16du" xmlns:w16sdtdh="http://schemas.microsoft.com/office/word/2020/wordml/sdtdatahash" xmlns:w16sdtfl="http://schemas.microsoft.com/office/word/2024/wordml/sdtformatlock" xmlns:w16se="http://schemas.microsoft.com/office/word/2015/wordml/symex" xmlns:wpg="http://schemas.microsoft.com/office/word/2010/wordprocessingGroup" xmlns:wpi="http://schemas.microsoft.com/office/word/2010/wordprocessingInk" xmlns:wne="http://schemas.microsoft.com/office/word/2006/wordml" xmlns:wps="http://schemas.microsoft.com/office/word/2010/wordprocessingShape" mc:Ignorable="w14 w15 w16se w16cid w16 w16cex w16sdtdh w16sdtfl w16du wp14">
   <w:footnote w:type="separator" w:id="-1">
@@ -991,7 +1112,69 @@
         <w:noProof/>
         <w:color w:val="808080" w:themeColor="background1" w:themeShade="80"/>
       </w:rPr>
-      <w:t>Executive Summary</w:t>
+      <w:t>2</w:t>
+    </w:r>
+    <w:r>
+      <w:rPr>
+        <w:color w:val="808080" w:themeColor="background1" w:themeShade="80"/>
+      </w:rPr>
+      <w:fldChar w:fldCharType="end"/>
+    </w:r>
+    <w:r>
+      <w:rPr>
+        <w:color w:val="808080" w:themeColor="background1" w:themeShade="80"/>
+      </w:rPr>
+      <w:tab/>
+    </w:r>
+    <w:r>
+      <w:rPr>
+        <w:color w:val="808080" w:themeColor="background1" w:themeShade="80"/>
+      </w:rPr>
+      <w:tab/>
+    </w:r>
+    <w:r>
+      <w:rPr>
+        <w:color w:val="808080" w:themeColor="background1" w:themeShade="80"/>
+      </w:rPr>
+      <w:t>Operational Performance Diagnostic</w:t>
+    </w:r>
+  </w:p>
+</w:hdr>
+</file>
+
+<file path=word/header5.xml><?xml version="1.0" encoding="utf-8"?>
+<w:hdr xmlns:wpc="http://schemas.microsoft.com/office/word/2010/wordprocessingCanvas" xmlns:cx="http://schemas.microsoft.com/office/drawing/2014/chartex" xmlns:cx1="http://schemas.microsoft.com/office/drawing/2015/9/8/chartex" xmlns:cx2="http://schemas.microsoft.com/office/drawing/2015/10/21/chartex" xmlns:cx3="http://schemas.microsoft.com/office/drawing/2016/5/9/chartex" xmlns:cx4="http://schemas.microsoft.com/office/drawing/2016/5/10/chartex" xmlns:cx5="http://schemas.microsoft.com/office/drawing/2016/5/11/chartex" xmlns:cx6="http://schemas.microsoft.com/office/drawing/2016/5/12/chartex" xmlns:cx7="http://schemas.microsoft.com/office/drawing/2016/5/13/chartex" xmlns:cx8="http://schemas.microsoft.com/office/drawing/2016/5/14/chartex" xmlns:mc="http://schemas.openxmlformats.org/markup-compatibility/2006" xmlns:aink="http://schemas.microsoft.com/office/drawing/2016/ink" xmlns:am3d="http://schemas.microsoft.com/office/drawing/2017/model3d" xmlns:o="urn:schemas-microsoft-com:office:office" xmlns:oel="http://schemas.microsoft.com/office/2019/extlst" xmlns:r="http://schemas.openxmlformats.org/officeDocument/2006/relationships" xmlns:m="http://schemas.openxmlformats.org/officeDocument/2006/math" xmlns:v="urn:schemas-microsoft-com:vml" xmlns:wp14="http://schemas.microsoft.com/office/word/2010/wordprocessingDrawing" xmlns:wp="http://schemas.openxmlformats.org/drawingml/2006/wordprocessingDrawing" xmlns:w10="urn:schemas-microsoft-com:office:word" xmlns:w="http://schemas.openxmlformats.org/wordprocessingml/2006/main" xmlns:w14="http://schemas.microsoft.com/office/word/2010/wordml" xmlns:w15="http://schemas.microsoft.com/office/word/2012/wordml" xmlns:w16cex="http://schemas.microsoft.com/office/word/2018/wordml/cex" xmlns:w16cid="http://schemas.microsoft.com/office/word/2016/wordml/cid" xmlns:w16="http://schemas.microsoft.com/office/word/2018/wordml" xmlns:w16du="http://schemas.microsoft.com/office/word/2023/wordml/word16du" xmlns:w16sdtdh="http://schemas.microsoft.com/office/word/2020/wordml/sdtdatahash" xmlns:w16sdtfl="http://schemas.microsoft.com/office/word/2024/wordml/sdtformatlock" xmlns:w16se="http://schemas.microsoft.com/office/word/2015/wordml/symex" xmlns:wpg="http://schemas.microsoft.com/office/word/2010/wordprocessingGroup" xmlns:wpi="http://schemas.microsoft.com/office/word/2010/wordprocessingInk" xmlns:wne="http://schemas.microsoft.com/office/word/2006/wordml" xmlns:wps="http://schemas.microsoft.com/office/word/2010/wordprocessingShape" mc:Ignorable="w14 w15 w16se w16cid w16 w16cex w16sdtdh w16sdtfl w16du wp14">
+  <w:p>
+    <w:pPr>
+      <w:pStyle w:val="Header"/>
+      <w:rPr>
+        <w:color w:val="808080" w:themeColor="background1" w:themeShade="80"/>
+      </w:rPr>
+    </w:pPr>
+    <w:r>
+      <w:rPr>
+        <w:color w:val="808080" w:themeColor="background1" w:themeShade="80"/>
+      </w:rPr>
+      <w:fldChar w:fldCharType="begin"/>
+    </w:r>
+    <w:r>
+      <w:rPr>
+        <w:color w:val="808080" w:themeColor="background1" w:themeShade="80"/>
+      </w:rPr>
+      <w:instrText xml:space="preserve"> STYLEREF  "Heading 1,h1,Level 1 Topic Heading,H1"  \* MERGEFORMAT </w:instrText>
+    </w:r>
+    <w:r>
+      <w:rPr>
+        <w:color w:val="808080" w:themeColor="background1" w:themeShade="80"/>
+      </w:rPr>
+      <w:fldChar w:fldCharType="separate"/>
+    </w:r>
+    <w:r>
+      <w:rPr>
+        <w:noProof/>
+        <w:color w:val="808080" w:themeColor="background1" w:themeShade="80"/>
+      </w:rPr>
+      <w:t>???</w:t>
     </w:r>
     <w:r>
       <w:rPr>
@@ -4443,6 +4626,7 @@
   </w:compat>
   <w:rsids>
     <w:rsidRoot w:val="00C40852"/>
+    <w:rsid w:val="00095C65"/>
     <w:rsid w:val="001F0C59"/>
     <w:rsid w:val="002714A6"/>
     <w:rsid w:val="002E79D1"/>
@@ -4470,6 +4654,7 @@
     <w:rsid w:val="00C80FDD"/>
     <w:rsid w:val="00D45064"/>
     <w:rsid w:val="00D538E7"/>
+    <w:rsid w:val="00D76C1D"/>
     <w:rsid w:val="00D900DE"/>
     <w:rsid w:val="00D924DE"/>
     <w:rsid w:val="00DA5A2F"/>

</xml_diff>

<commit_message>
Update roadmap_template.docx — format changes
Co-Authored-By: Claude Sonnet 4.6 <noreply@anthropic.com>
</commit_message>
<xml_diff>
--- a/assets/roadmap_template.docx
+++ b/assets/roadmap_template.docx
@@ -1076,6 +1076,12 @@
         <w:color w:val="808080" w:themeColor="background1" w:themeShade="80"/>
       </w:rPr>
     </w:pPr>
+    <w:r>
+      <w:rPr>
+        <w:color w:val="808080" w:themeColor="background1" w:themeShade="80"/>
+      </w:rPr>
+      <w:t>Table of Contents</w:t>
+    </w:r>
   </w:p>
 </w:hdr>
 </file>
@@ -4633,6 +4639,7 @@
     <w:rsid w:val="002F6AD3"/>
     <w:rsid w:val="003617E9"/>
     <w:rsid w:val="00416F18"/>
+    <w:rsid w:val="0045058F"/>
     <w:rsid w:val="00490059"/>
     <w:rsid w:val="00493C18"/>
     <w:rsid w:val="004A7DD0"/>
@@ -4661,6 +4668,7 @@
     <w:rsid w:val="00DF10AF"/>
     <w:rsid w:val="00E41951"/>
     <w:rsid w:val="00EA1CFA"/>
+    <w:rsid w:val="00EB127C"/>
     <w:rsid w:val="00F00744"/>
     <w:rsid w:val="00F31340"/>
     <w:rsid w:val="00F71D1D"/>

</xml_diff>

<commit_message>
Report output quality Session 2 — ROADMAP_EXTRACTION_PROMPT capability constraint (one sentence, falsifiable, outcome-oriented); ROADMAP INITIATIVE FORMAT block; PROGRESS.md updated
Co-Authored-By: Claude Sonnet 4.6 <noreply@anthropic.com>
</commit_message>
<xml_diff>
--- a/assets/roadmap_template.docx
+++ b/assets/roadmap_template.docx
@@ -328,7 +328,7 @@
                 <w:docPart w:val="233EE8DC6DF04F278E1721531BF41F73"/>
               </w:placeholder>
               <w:dataBinding w:prefixMappings="xmlns:ns0='http://schemas.microsoft.com/office/2006/coverPageProps' " w:xpath="/ns0:CoverPageProperties[1]/ns0:PublishDate[1]" w:storeItemID="{55AF091B-3C7A-41E3-B477-F2FDAA23CFDA}"/>
-              <w:date w:fullDate="2026-04-03T00:00:00Z">
+              <w:date w:fullDate="2026-04-17T00:00:00Z">
                 <w:dateFormat w:val="M/d/yyyy"/>
                 <w:lid w:val="en-US"/>
                 <w:storeMappedDataAs w:val="dateTime"/>
@@ -345,7 +345,7 @@
                     <w:sz w:val="24"/>
                     <w:szCs w:val="24"/>
                   </w:rPr>
-                  <w:t>4/3/2026</w:t>
+                  <w:t>4/17/2026</w:t>
                 </w:r>
               </w:p>
             </w:sdtContent>
@@ -4632,7 +4632,9 @@
   </w:compat>
   <w:rsids>
     <w:rsidRoot w:val="00C40852"/>
+    <w:rsid w:val="00057855"/>
     <w:rsid w:val="00095C65"/>
+    <w:rsid w:val="001377AE"/>
     <w:rsid w:val="001F0C59"/>
     <w:rsid w:val="002714A6"/>
     <w:rsid w:val="002E79D1"/>
@@ -5445,7 +5447,7 @@
 
 <file path=customXml/item1.xml><?xml version="1.0" encoding="utf-8"?>
 <CoverPageProperties xmlns="http://schemas.microsoft.com/office/2006/coverPageProps">
-  <PublishDate>2026-04-03T00:00:00</PublishDate>
+  <PublishDate>2026-04-17T00:00:00</PublishDate>
   <Abstract/>
   <CompanyAddress/>
   <CompanyPhone/>

</xml_diff>